<commit_message>
Download link for the fall data set
</commit_message>
<xml_diff>
--- a/Download link for the fall data set.docx
+++ b/Download link for the fall data set.docx
@@ -3,177 +3,349 @@
 <w:document xmlns:wpc="http://schemas.microsoft.com/office/word/2010/wordprocessingCanvas" xmlns:cx="http://schemas.microsoft.com/office/drawing/2014/chartex" xmlns:cx1="http://schemas.microsoft.com/office/drawing/2015/9/8/chartex" xmlns:cx2="http://schemas.microsoft.com/office/drawing/2015/10/21/chartex" xmlns:cx3="http://schemas.microsoft.com/office/drawing/2016/5/9/chartex" xmlns:cx4="http://schemas.microsoft.com/office/drawing/2016/5/10/chartex" xmlns:cx5="http://schemas.microsoft.com/office/drawing/2016/5/11/chartex" xmlns:cx6="http://schemas.microsoft.com/office/drawing/2016/5/12/chartex" xmlns:cx7="http://schemas.microsoft.com/office/drawing/2016/5/13/chartex" xmlns:cx8="http://schemas.microsoft.com/office/drawing/2016/5/14/chartex" xmlns:mc="http://schemas.openxmlformats.org/markup-compatibility/2006" xmlns:aink="http://schemas.microsoft.com/office/drawing/2016/ink" xmlns:am3d="http://schemas.microsoft.com/office/drawing/2017/model3d" xmlns:o="urn:schemas-microsoft-com:office:office" xmlns:r="http://schemas.openxmlformats.org/officeDocument/2006/relationships" xmlns:m="http://schemas.openxmlformats.org/officeDocument/2006/math" xmlns:v="urn:schemas-microsoft-com:vml" xmlns:wp14="http://schemas.microsoft.com/office/word/2010/wordprocessingDrawing" xmlns:wp="http://schemas.openxmlformats.org/drawingml/2006/wordprocessingDrawing" xmlns:w10="urn:schemas-microsoft-com:office:word" xmlns:w="http://schemas.openxmlformats.org/wordprocessingml/2006/main" xmlns:w14="http://schemas.microsoft.com/office/word/2010/wordml" xmlns:w15="http://schemas.microsoft.com/office/word/2012/wordml" xmlns:w16cex="http://schemas.microsoft.com/office/word/2018/wordml/cex" xmlns:w16cid="http://schemas.microsoft.com/office/word/2016/wordml/cid" xmlns:w16="http://schemas.microsoft.com/office/word/2018/wordml" xmlns:w16sdtdh="http://schemas.microsoft.com/office/word/2020/wordml/sdtdatahash" xmlns:w16se="http://schemas.microsoft.com/office/word/2015/wordml/symex" xmlns:wpg="http://schemas.microsoft.com/office/word/2010/wordprocessingGroup" xmlns:wpi="http://schemas.microsoft.com/office/word/2010/wordprocessingInk" xmlns:wne="http://schemas.microsoft.com/office/word/2006/wordml" xmlns:wps="http://schemas.microsoft.com/office/word/2010/wordprocessingShape" mc:Ignorable="w14 w15 w16se w16cid w16 w16cex w16sdtdh wp14">
   <w:body>
     <w:p>
-      <w:r>
+      <w:pPr>
+        <w:jc w:val="center"/>
+        <w:rPr>
+          <w:rFonts w:ascii="Times New Roman" w:hAnsi="Times New Roman" w:cs="Times New Roman"/>
+          <w:sz w:val="28"/>
+          <w:szCs w:val="32"/>
+        </w:rPr>
+      </w:pPr>
+      <w:r>
+        <w:rPr>
+          <w:rFonts w:ascii="Times New Roman" w:hAnsi="Times New Roman" w:cs="Times New Roman"/>
+          <w:sz w:val="28"/>
+          <w:szCs w:val="32"/>
+        </w:rPr>
+        <w:t>Data Explanation</w:t>
+      </w:r>
+    </w:p>
+    <w:p>
+      <w:pPr>
+        <w:ind w:firstLineChars="200" w:firstLine="420"/>
+        <w:jc w:val="left"/>
+        <w:rPr>
+          <w:rFonts w:ascii="Times New Roman" w:hAnsi="Times New Roman" w:cs="Times New Roman"/>
+        </w:rPr>
+      </w:pPr>
+      <w:r>
+        <w:rPr>
+          <w:rFonts w:ascii="Times New Roman" w:hAnsi="Times New Roman" w:cs="Times New Roman"/>
+        </w:rPr>
+        <w:t>For all the datasets used in the research on fall behaviors, they can be downloaded from the following link.</w:t>
+      </w:r>
+    </w:p>
+    <w:p>
+      <w:pPr>
+        <w:ind w:firstLineChars="200" w:firstLine="420"/>
+        <w:jc w:val="left"/>
+        <w:rPr>
+          <w:rFonts w:ascii="Times New Roman" w:hAnsi="Times New Roman" w:cs="Times New Roman"/>
+        </w:rPr>
+      </w:pPr>
+    </w:p>
+    <w:p>
+      <w:pPr>
+        <w:jc w:val="left"/>
+        <w:rPr>
+          <w:rFonts w:ascii="Times New Roman" w:hAnsi="Times New Roman" w:cs="Times New Roman"/>
+        </w:rPr>
+      </w:pPr>
+      <w:r>
+        <w:rPr>
+          <w:rFonts w:ascii="Times New Roman" w:hAnsi="Times New Roman" w:cs="Times New Roman"/>
+        </w:rPr>
         <w:t>NTU RGB+D</w:t>
       </w:r>
       <w:r>
+        <w:rPr>
+          <w:rFonts w:ascii="Times New Roman" w:hAnsi="Times New Roman" w:cs="Times New Roman"/>
+        </w:rPr>
+        <w:t xml:space="preserve"> and NTU RGB+D120</w:t>
+      </w:r>
+      <w:r>
+        <w:rPr>
+          <w:rFonts w:ascii="Times New Roman" w:hAnsi="Times New Roman" w:cs="Times New Roman"/>
+        </w:rPr>
+        <w:t>:</w:t>
+      </w:r>
+      <w:r>
+        <w:rPr>
+          <w:rFonts w:ascii="Times New Roman" w:hAnsi="Times New Roman" w:cs="Times New Roman"/>
+        </w:rPr>
+        <w:t xml:space="preserve">  https://rose1.ntu.edu.sg/dataset/actionRecognition/</w:t>
+      </w:r>
+    </w:p>
+    <w:p>
+      <w:pPr>
+        <w:jc w:val="left"/>
+        <w:rPr>
+          <w:rFonts w:ascii="Times New Roman" w:hAnsi="Times New Roman" w:cs="Times New Roman"/>
+        </w:rPr>
+      </w:pPr>
+    </w:p>
+    <w:p>
+      <w:pPr>
+        <w:jc w:val="left"/>
+        <w:rPr>
+          <w:rFonts w:ascii="Times New Roman" w:hAnsi="Times New Roman" w:cs="Times New Roman"/>
+        </w:rPr>
+      </w:pPr>
+      <w:r>
+        <w:rPr>
+          <w:rFonts w:ascii="Times New Roman" w:hAnsi="Times New Roman" w:cs="Times New Roman"/>
+        </w:rPr>
+        <w:t>CASIA</w:t>
+      </w:r>
+      <w:r>
+        <w:rPr>
+          <w:rFonts w:ascii="Times New Roman" w:hAnsi="Times New Roman" w:cs="Times New Roman"/>
+        </w:rPr>
+        <w:t xml:space="preserve">: </w:t>
+      </w:r>
+      <w:r>
+        <w:rPr>
+          <w:rFonts w:ascii="Times New Roman" w:hAnsi="Times New Roman" w:cs="Times New Roman"/>
+        </w:rPr>
         <w:t xml:space="preserve"> </w:t>
       </w:r>
       <w:r>
         <w:rPr>
-          <w:rFonts w:hint="eastAsia"/>
-        </w:rPr>
-        <w:t>and</w:t>
-      </w:r>
-      <w:r>
+          <w:rFonts w:ascii="Times New Roman" w:hAnsi="Times New Roman" w:cs="Times New Roman"/>
+        </w:rPr>
+        <w:t>http://www.cbsr.ia.ac.cn/china/Gait%20Databases%20CH.asp</w:t>
+      </w:r>
+    </w:p>
+    <w:p>
+      <w:pPr>
+        <w:jc w:val="left"/>
+        <w:rPr>
+          <w:rFonts w:ascii="Times New Roman" w:hAnsi="Times New Roman" w:cs="Times New Roman"/>
+        </w:rPr>
+      </w:pPr>
+    </w:p>
+    <w:p>
+      <w:pPr>
+        <w:jc w:val="left"/>
+        <w:rPr>
+          <w:rFonts w:ascii="Times New Roman" w:hAnsi="Times New Roman" w:cs="Times New Roman"/>
+        </w:rPr>
+      </w:pPr>
+      <w:proofErr w:type="spellStart"/>
+      <w:r>
+        <w:rPr>
+          <w:rFonts w:ascii="Times New Roman" w:hAnsi="Times New Roman" w:cs="Times New Roman"/>
+        </w:rPr>
+        <w:t>Sisfall</w:t>
+      </w:r>
+      <w:proofErr w:type="spellEnd"/>
+      <w:r>
+        <w:rPr>
+          <w:rFonts w:ascii="Times New Roman" w:hAnsi="Times New Roman" w:cs="Times New Roman"/>
+        </w:rPr>
+        <w:t>:</w:t>
+      </w:r>
+      <w:r>
+        <w:rPr>
+          <w:rFonts w:ascii="Times New Roman" w:hAnsi="Times New Roman" w:cs="Times New Roman"/>
+        </w:rPr>
+        <w:t xml:space="preserve">  https://blog.csdn.net/gitblog_09715/article/details/143408170</w:t>
+      </w:r>
+    </w:p>
+    <w:p>
+      <w:pPr>
+        <w:jc w:val="left"/>
+        <w:rPr>
+          <w:rFonts w:ascii="Times New Roman" w:hAnsi="Times New Roman" w:cs="Times New Roman"/>
+        </w:rPr>
+      </w:pPr>
+    </w:p>
+    <w:p>
+      <w:pPr>
+        <w:jc w:val="left"/>
+        <w:rPr>
+          <w:rFonts w:ascii="Times New Roman" w:hAnsi="Times New Roman" w:cs="Times New Roman"/>
+        </w:rPr>
+      </w:pPr>
+      <w:proofErr w:type="gramStart"/>
+      <w:r>
+        <w:rPr>
+          <w:rFonts w:ascii="Times New Roman" w:hAnsi="Times New Roman" w:cs="Times New Roman"/>
+        </w:rPr>
+        <w:t>WISDM</w:t>
+      </w:r>
+      <w:r>
+        <w:rPr>
+          <w:rFonts w:ascii="Times New Roman" w:hAnsi="Times New Roman" w:cs="Times New Roman"/>
+        </w:rPr>
+        <w:t xml:space="preserve">  </w:t>
+      </w:r>
+      <w:r>
+        <w:rPr>
+          <w:rFonts w:ascii="Times New Roman" w:hAnsi="Times New Roman" w:cs="Times New Roman"/>
+        </w:rPr>
+        <w:t>:</w:t>
+      </w:r>
+      <w:proofErr w:type="gramEnd"/>
+      <w:r>
+        <w:rPr>
+          <w:rFonts w:ascii="Times New Roman" w:hAnsi="Times New Roman" w:cs="Times New Roman"/>
+        </w:rPr>
+        <w:t>https://cloud.tencent.com/developer/tools/blog-entry?target=https%3A%2F%2Fwww.cis.fordham.edu%2Fwisdm%2Fincludes%2Fdatasets%2Flatest%2FWISDM_ar_latest.tar.gz&amp;objectId=2502081&amp;objectType=1&amp;contentType=undefined</w:t>
+      </w:r>
+    </w:p>
+    <w:p>
+      <w:pPr>
+        <w:jc w:val="left"/>
+        <w:rPr>
+          <w:rFonts w:ascii="Times New Roman" w:hAnsi="Times New Roman" w:cs="Times New Roman"/>
+        </w:rPr>
+      </w:pPr>
+    </w:p>
+    <w:p>
+      <w:pPr>
+        <w:jc w:val="left"/>
+        <w:rPr>
+          <w:rFonts w:ascii="Times New Roman" w:hAnsi="Times New Roman" w:cs="Times New Roman"/>
+        </w:rPr>
+      </w:pPr>
+      <w:r>
+        <w:rPr>
+          <w:rFonts w:ascii="Times New Roman" w:hAnsi="Times New Roman" w:cs="Times New Roman"/>
+        </w:rPr>
+        <w:t>Le2i Fall Detection Dataset</w:t>
+      </w:r>
+      <w:r>
+        <w:rPr>
+          <w:rFonts w:ascii="Times New Roman" w:hAnsi="Times New Roman" w:cs="Times New Roman"/>
+        </w:rPr>
+        <w:t>:</w:t>
+      </w:r>
+      <w:r>
+        <w:rPr>
+          <w:rFonts w:ascii="Times New Roman" w:hAnsi="Times New Roman" w:cs="Times New Roman"/>
+        </w:rPr>
         <w:t xml:space="preserve"> </w:t>
       </w:r>
       <w:r>
-        <w:t>NTU RGB+D</w:t>
+        <w:rPr>
+          <w:rFonts w:ascii="Times New Roman" w:hAnsi="Times New Roman" w:cs="Times New Roman"/>
+        </w:rPr>
+        <w:t xml:space="preserve"> </w:t>
+      </w:r>
+      <w:r>
+        <w:rPr>
+          <w:rFonts w:ascii="Times New Roman" w:hAnsi="Times New Roman" w:cs="Times New Roman"/>
+        </w:rPr>
+        <w:t>https://blog.csdn.net/dujuancao11/article/details/116863359</w:t>
+      </w:r>
+    </w:p>
+    <w:p>
+      <w:pPr>
+        <w:jc w:val="left"/>
+        <w:rPr>
+          <w:rFonts w:ascii="Times New Roman" w:hAnsi="Times New Roman" w:cs="Times New Roman"/>
+        </w:rPr>
+      </w:pPr>
+    </w:p>
+    <w:p>
+      <w:pPr>
+        <w:jc w:val="left"/>
+        <w:rPr>
+          <w:rFonts w:ascii="Times New Roman" w:hAnsi="Times New Roman" w:cs="Times New Roman"/>
+        </w:rPr>
+      </w:pPr>
+      <w:r>
+        <w:rPr>
+          <w:rFonts w:ascii="Times New Roman" w:hAnsi="Times New Roman" w:cs="Times New Roman"/>
+        </w:rPr>
+        <w:t>UR Fall Detection Dataset</w:t>
+      </w:r>
+      <w:r>
+        <w:rPr>
+          <w:rFonts w:ascii="Times New Roman" w:hAnsi="Times New Roman" w:cs="Times New Roman"/>
+        </w:rPr>
+        <w:t>:</w:t>
+      </w:r>
+      <w:r>
+        <w:rPr>
+          <w:rFonts w:ascii="Times New Roman" w:hAnsi="Times New Roman" w:cs="Times New Roman"/>
+        </w:rPr>
+        <w:t xml:space="preserve">  https://blog.csdn.net/sinat_28371057/article/details/111600737</w:t>
+      </w:r>
+    </w:p>
+    <w:p>
+      <w:pPr>
+        <w:jc w:val="left"/>
+        <w:rPr>
+          <w:rFonts w:ascii="Times New Roman" w:hAnsi="Times New Roman" w:cs="Times New Roman"/>
+        </w:rPr>
+      </w:pPr>
+    </w:p>
+    <w:p>
+      <w:pPr>
+        <w:jc w:val="left"/>
+        <w:rPr>
+          <w:rFonts w:ascii="Times New Roman" w:hAnsi="Times New Roman" w:cs="Times New Roman"/>
+        </w:rPr>
+      </w:pPr>
+      <w:r>
+        <w:rPr>
+          <w:rFonts w:ascii="Times New Roman" w:hAnsi="Times New Roman" w:cs="Times New Roman"/>
+        </w:rPr>
+        <w:t xml:space="preserve">Elderly Fall Detection IoT Dataset and </w:t>
+      </w:r>
+      <w:r>
+        <w:rPr>
+          <w:rFonts w:ascii="Times New Roman" w:hAnsi="Times New Roman" w:cs="Times New Roman"/>
+        </w:rPr>
+        <w:t>Elderly Fall Detection Dataset</w:t>
+      </w:r>
+      <w:r>
+        <w:rPr>
+          <w:rFonts w:ascii="Times New Roman" w:hAnsi="Times New Roman" w:cs="Times New Roman"/>
+        </w:rPr>
+        <w:t xml:space="preserve">: </w:t>
+      </w:r>
+      <w:r>
+        <w:rPr>
+          <w:rFonts w:ascii="Times New Roman" w:hAnsi="Times New Roman" w:cs="Times New Roman"/>
+        </w:rPr>
+        <w:t xml:space="preserve"> </w:t>
+      </w:r>
+      <w:r>
+        <w:rPr>
+          <w:rFonts w:ascii="Times New Roman" w:hAnsi="Times New Roman" w:cs="Times New Roman"/>
+        </w:rPr>
+        <w:t>Shared files via cloud drive: Database of Falls Behavior Research</w:t>
+      </w:r>
+    </w:p>
+    <w:p>
+      <w:pPr>
+        <w:jc w:val="left"/>
+        <w:rPr>
+          <w:rFonts w:ascii="Times New Roman" w:hAnsi="Times New Roman" w:cs="Times New Roman"/>
+        </w:rPr>
+      </w:pPr>
+      <w:r>
+        <w:rPr>
+          <w:rFonts w:ascii="Times New Roman" w:hAnsi="Times New Roman" w:cs="Times New Roman"/>
+        </w:rPr>
+        <w:t xml:space="preserve">Link: </w:t>
       </w:r>
       <w:proofErr w:type="gramStart"/>
       <w:r>
-        <w:t xml:space="preserve">120 </w:t>
-      </w:r>
-      <w:r>
-        <w:rPr>
-          <w:rFonts w:hint="eastAsia"/>
-        </w:rPr>
-        <w:t xml:space="preserve"> </w:t>
-      </w:r>
-      <w:r>
-        <w:t>https://rose1.ntu.edu.sg/dataset/actionRecognition/</w:t>
+        <w:rPr>
+          <w:rFonts w:ascii="Times New Roman" w:hAnsi="Times New Roman" w:cs="Times New Roman"/>
+        </w:rPr>
+        <w:t>https://pan.baidu.com/s/1UhiApV1Ct433DaGN4zYlSA?pwd=tr4q  Extraction</w:t>
       </w:r>
       <w:proofErr w:type="gramEnd"/>
-    </w:p>
-    <w:p/>
-    <w:p>
-      <w:r>
-        <w:t>CASIA</w:t>
-      </w:r>
-      <w:r>
-        <w:t xml:space="preserve"> </w:t>
-      </w:r>
-      <w:r>
-        <w:t>http://www.cbsr.ia.ac.cn/china/Gait%20Databases%20CH.asp</w:t>
-      </w:r>
-    </w:p>
-    <w:p/>
-    <w:p>
-      <w:proofErr w:type="spellStart"/>
-      <w:proofErr w:type="gramStart"/>
-      <w:r>
-        <w:t>Sisfall</w:t>
-      </w:r>
-      <w:proofErr w:type="spellEnd"/>
-      <w:r>
-        <w:t xml:space="preserve">  </w:t>
-      </w:r>
-      <w:r>
-        <w:t>https://blog.csdn.net/gitblog_09715/article/details/143408170</w:t>
-      </w:r>
-      <w:proofErr w:type="gramEnd"/>
-    </w:p>
-    <w:p/>
-    <w:p>
-      <w:proofErr w:type="gramStart"/>
-      <w:r>
-        <w:rPr>
-          <w:rFonts w:hint="eastAsia"/>
-        </w:rPr>
-        <w:t>W</w:t>
-      </w:r>
-      <w:r>
-        <w:t>ISDM</w:t>
-      </w:r>
-      <w:r>
-        <w:t xml:space="preserve"> </w:t>
-      </w:r>
-      <w:r>
-        <w:t xml:space="preserve"> </w:t>
-      </w:r>
-      <w:r>
-        <w:t>https://cloud.tencent.com/developer/tools/blog-entry?target=https%3A%2F%2Fwww.cis.fordham.edu%2Fwisdm%2Fincludes%2Fdatasets%2Flatest%2FWISDM_ar_latest.tar.gz&amp;objectId=2502081&amp;objectType=1&amp;contentType=undefined</w:t>
-      </w:r>
-      <w:proofErr w:type="gramEnd"/>
-    </w:p>
-    <w:p/>
-    <w:p>
-      <w:r>
-        <w:t xml:space="preserve">Le2i Fall Detection </w:t>
-      </w:r>
-      <w:proofErr w:type="gramStart"/>
-      <w:r>
-        <w:t>Dataset</w:t>
-      </w:r>
-      <w:r>
-        <w:t xml:space="preserve"> </w:t>
-      </w:r>
-      <w:r>
-        <w:t xml:space="preserve"> </w:t>
-      </w:r>
-      <w:r>
-        <w:t>https://blog.csdn.net/dujuancao11/article/details/116863359</w:t>
-      </w:r>
-      <w:proofErr w:type="gramEnd"/>
-    </w:p>
-    <w:p/>
-    <w:p>
-      <w:r>
-        <w:t xml:space="preserve">UR Fall Detection </w:t>
-      </w:r>
-      <w:proofErr w:type="gramStart"/>
-      <w:r>
-        <w:t>Dataset</w:t>
-      </w:r>
-      <w:r>
-        <w:t xml:space="preserve">  </w:t>
-      </w:r>
-      <w:r>
-        <w:t>https://blog.csdn.net/sinat_28371057/article/details/111600737</w:t>
-      </w:r>
-      <w:proofErr w:type="gramEnd"/>
-    </w:p>
-    <w:p/>
-    <w:p>
-      <w:r>
-        <w:t>Elderly Fall Detection IoT Dataset</w:t>
-      </w:r>
-      <w:r>
-        <w:t xml:space="preserve"> </w:t>
-      </w:r>
-      <w:r>
-        <w:rPr>
-          <w:rFonts w:hint="eastAsia"/>
-        </w:rPr>
-        <w:t>and</w:t>
-      </w:r>
-      <w:r>
-        <w:t xml:space="preserve"> </w:t>
-      </w:r>
-      <w:r>
-        <w:t>Elderly Fall Detection Dataset</w:t>
-      </w:r>
-      <w:r>
-        <w:t xml:space="preserve"> </w:t>
-      </w:r>
-      <w:proofErr w:type="gramStart"/>
-      <w:r>
-        <w:rPr>
-          <w:rFonts w:hint="eastAsia"/>
-        </w:rPr>
-        <w:t>通过网盘分享</w:t>
-      </w:r>
-      <w:proofErr w:type="gramEnd"/>
-      <w:r>
-        <w:rPr>
-          <w:rFonts w:hint="eastAsia"/>
-        </w:rPr>
-        <w:t>的文件：</w:t>
-      </w:r>
-      <w:r>
-        <w:t>Database of Falls Behavior Research</w:t>
-      </w:r>
-    </w:p>
-    <w:p>
-      <w:r>
-        <w:rPr>
-          <w:rFonts w:hint="eastAsia"/>
-        </w:rPr>
-        <w:t>链接</w:t>
-      </w:r>
-      <w:r>
-        <w:t>: https://pan.baidu.com/s/1UhiApV1Ct433DaGN4zYlSA?pwd=tr4q 提取码: tr4q</w:t>
+      <w:r>
+        <w:rPr>
+          <w:rFonts w:ascii="Times New Roman" w:hAnsi="Times New Roman" w:cs="Times New Roman"/>
+        </w:rPr>
+        <w:t xml:space="preserve"> code: tr4q</w:t>
       </w:r>
     </w:p>
     <w:sectPr>

</xml_diff>